<commit_message>
Mejora de recuperacion y coherencia de respuestas
- rag.py: k de 4 a 5 fragmentos; si el modelo no halla la respuesta, no muestra citas
- make_demo_pdf.py: prerrequisito consistente (quinto semestre) en reglamento y silabo
</commit_message>
<xml_diff>
--- a/documentacion/Guia_Tecnica_Sistema.docx
+++ b/documentacion/Guia_Tecnica_Sistema.docx
@@ -17,23 +17,6 @@
           <w:lang w:val="es-MX"/>
         </w:rPr>
         <w:t>Guía técnica del sistema</w:t>
-      </w:r>
-    </w:p>
-    <w:p>
-      <w:pPr>
-        <w:spacing w:after="40"/>
-        <w:rPr>
-          <w:lang w:val="es-MX"/>
-        </w:rPr>
-      </w:pPr>
-      <w:r>
-        <w:rPr>
-          <w:i/>
-          <w:color w:val="555555"/>
-          <w:sz w:val="23"/>
-          <w:lang w:val="es-MX"/>
-        </w:rPr>
-        <w:t>Asistente RAG de Prácticum — cómo funciona cada componente y cómo se conecta</w:t>
       </w:r>
     </w:p>
     <w:p>
@@ -152,7 +135,6 @@
             <w:shd w:val="clear" w:color="auto" w:fill="1F3864"/>
           </w:tcPr>
           <w:p>
-            <w:proofErr w:type="spellStart"/>
             <w:r>
               <w:rPr>
                 <w:b/>
@@ -161,7 +143,6 @@
               </w:rPr>
               <w:t>Archivo</w:t>
             </w:r>
-            <w:proofErr w:type="spellEnd"/>
           </w:p>
         </w:tc>
         <w:tc>
@@ -384,7 +365,7 @@
               <w:rPr>
                 <w:sz w:val="19"/>
               </w:rPr>
-              <w:t>EL CEREBRO / orquestador</w:t>
+              <w:t>orquestador</w:t>
             </w:r>
           </w:p>
         </w:tc>
@@ -397,7 +378,7 @@
               <w:rPr>
                 <w:sz w:val="19"/>
               </w:rPr>
-              <w:t>— (usa los adaptadores)</w:t>
+              <w:t>(usa los adaptadores)</w:t>
             </w:r>
           </w:p>
         </w:tc>
@@ -539,30 +520,21 @@
       </w:pPr>
       <w:r>
         <w:rPr>
-          <w:b/>
           <w:lang w:val="es-MX"/>
         </w:rPr>
-        <w:t xml:space="preserve">Clave: </w:t>
+        <w:t xml:space="preserve">rag.py NO conoce ChromaDB ni Gemini directamente; </w:t>
       </w:r>
       <w:r>
         <w:rPr>
           <w:lang w:val="es-MX"/>
         </w:rPr>
-        <w:t xml:space="preserve">rag.py NO conoce </w:t>
+        <w:t>conecta</w:t>
       </w:r>
-      <w:proofErr w:type="spellStart"/>
       <w:r>
         <w:rPr>
           <w:lang w:val="es-MX"/>
         </w:rPr>
-        <w:t>ChromaDB</w:t>
-      </w:r>
-      <w:proofErr w:type="spellEnd"/>
-      <w:r>
-        <w:rPr>
-          <w:lang w:val="es-MX"/>
-        </w:rPr>
-        <w:t xml:space="preserve"> ni Gemini directamente; habla con los adaptadores. Por eso cambiar una herramienta = cambiar un solo archivo.</w:t>
+        <w:t xml:space="preserve"> con los adaptadores. Por eso cambiar una herramienta = cambiar un solo archivo.</w:t>
       </w:r>
     </w:p>
     <w:p>
@@ -596,9 +568,8 @@
           <w:sz w:val="24"/>
           <w:lang w:val="es-MX"/>
         </w:rPr>
-        <w:t xml:space="preserve">A) INGESTA — preparar el </w:t>
+        <w:t>A) INGESTA</w:t>
       </w:r>
-      <w:proofErr w:type="gramStart"/>
       <w:r>
         <w:rPr>
           <w:b/>
@@ -606,9 +577,8 @@
           <w:sz w:val="24"/>
           <w:lang w:val="es-MX"/>
         </w:rPr>
-        <w:t>conocimiento  (</w:t>
+        <w:t>:</w:t>
       </w:r>
-      <w:proofErr w:type="gramEnd"/>
       <w:r>
         <w:rPr>
           <w:b/>
@@ -616,7 +586,7 @@
           <w:sz w:val="24"/>
           <w:lang w:val="es-MX"/>
         </w:rPr>
-        <w:t>ingest.py)</w:t>
+        <w:t xml:space="preserve"> preparar el conocimiento  (ingest.py)</w:t>
       </w:r>
     </w:p>
     <w:p>
@@ -658,35 +628,7 @@
         <w:rPr>
           <w:lang w:val="es-MX"/>
         </w:rPr>
-        <w:t xml:space="preserve">•  </w:t>
-      </w:r>
-      <w:proofErr w:type="spellStart"/>
-      <w:r>
-        <w:rPr>
-          <w:lang w:val="es-MX"/>
-        </w:rPr>
-        <w:t>pdfreader</w:t>
-      </w:r>
-      <w:proofErr w:type="spellEnd"/>
-      <w:r>
-        <w:rPr>
-          <w:lang w:val="es-MX"/>
-        </w:rPr>
-        <w:t xml:space="preserve"> extrae el texto de cada página (</w:t>
-      </w:r>
-      <w:proofErr w:type="spellStart"/>
-      <w:r>
-        <w:rPr>
-          <w:lang w:val="es-MX"/>
-        </w:rPr>
-        <w:t>PyMuPDF</w:t>
-      </w:r>
-      <w:proofErr w:type="spellEnd"/>
-      <w:r>
-        <w:rPr>
-          <w:lang w:val="es-MX"/>
-        </w:rPr>
-        <w:t>).</w:t>
+        <w:t>•  pdfreader extrae el texto de cada página (PyMuPDF).</w:t>
       </w:r>
     </w:p>
     <w:p>
@@ -700,35 +642,7 @@
         <w:rPr>
           <w:lang w:val="es-MX"/>
         </w:rPr>
-        <w:t xml:space="preserve">•  </w:t>
-      </w:r>
-      <w:proofErr w:type="spellStart"/>
-      <w:r>
-        <w:rPr>
-          <w:lang w:val="es-MX"/>
-        </w:rPr>
-        <w:t>chunk_</w:t>
-      </w:r>
-      <w:proofErr w:type="gramStart"/>
-      <w:r>
-        <w:rPr>
-          <w:lang w:val="es-MX"/>
-        </w:rPr>
-        <w:t>text</w:t>
-      </w:r>
-      <w:proofErr w:type="spellEnd"/>
-      <w:r>
-        <w:rPr>
-          <w:lang w:val="es-MX"/>
-        </w:rPr>
-        <w:t>(</w:t>
-      </w:r>
-      <w:proofErr w:type="gramEnd"/>
-      <w:r>
-        <w:rPr>
-          <w:lang w:val="es-MX"/>
-        </w:rPr>
-        <w:t>) parte el texto en fragmentos de ~500 caracteres.</w:t>
+        <w:t>•  chunk_text() parte el texto en fragmentos de ~500 caracteres.</w:t>
       </w:r>
     </w:p>
     <w:p>
@@ -742,35 +656,7 @@
         <w:rPr>
           <w:lang w:val="es-MX"/>
         </w:rPr>
-        <w:t>•  A cada fragmento se le pega su etiqueta: archivo, página y alcance (</w:t>
-      </w:r>
-      <w:proofErr w:type="spellStart"/>
-      <w:r>
-        <w:rPr>
-          <w:lang w:val="es-MX"/>
-        </w:rPr>
-        <w:t>carrera|global</w:t>
-      </w:r>
-      <w:proofErr w:type="spellEnd"/>
-      <w:r>
-        <w:rPr>
-          <w:lang w:val="es-MX"/>
-        </w:rPr>
-        <w:t xml:space="preserve"> o </w:t>
-      </w:r>
-      <w:proofErr w:type="spellStart"/>
-      <w:r>
-        <w:rPr>
-          <w:lang w:val="es-MX"/>
-        </w:rPr>
-        <w:t>carrera|curso:X</w:t>
-      </w:r>
-      <w:proofErr w:type="spellEnd"/>
-      <w:r>
-        <w:rPr>
-          <w:lang w:val="es-MX"/>
-        </w:rPr>
-        <w:t>).</w:t>
+        <w:t>•  A cada fragmento se le pega su etiqueta: archivo, página y alcance (carrera|global o carrera|curso:X).</w:t>
       </w:r>
     </w:p>
     <w:p>
@@ -784,57 +670,7 @@
         <w:rPr>
           <w:lang w:val="es-MX"/>
         </w:rPr>
-        <w:t xml:space="preserve">•  </w:t>
-      </w:r>
-      <w:proofErr w:type="spellStart"/>
-      <w:proofErr w:type="gramStart"/>
-      <w:r>
-        <w:rPr>
-          <w:lang w:val="es-MX"/>
-        </w:rPr>
-        <w:t>vectorstore.add</w:t>
-      </w:r>
-      <w:proofErr w:type="spellEnd"/>
-      <w:r>
-        <w:rPr>
-          <w:lang w:val="es-MX"/>
-        </w:rPr>
-        <w:t>(</w:t>
-      </w:r>
-      <w:proofErr w:type="gramEnd"/>
-      <w:r>
-        <w:rPr>
-          <w:lang w:val="es-MX"/>
-        </w:rPr>
-        <w:t>) convierte cada fragmento en un vector (</w:t>
-      </w:r>
-      <w:proofErr w:type="spellStart"/>
-      <w:r>
-        <w:rPr>
-          <w:lang w:val="es-MX"/>
-        </w:rPr>
-        <w:t>MiniLM</w:t>
-      </w:r>
-      <w:proofErr w:type="spellEnd"/>
-      <w:r>
-        <w:rPr>
-          <w:lang w:val="es-MX"/>
-        </w:rPr>
-        <w:t xml:space="preserve">) y lo guarda en </w:t>
-      </w:r>
-      <w:proofErr w:type="spellStart"/>
-      <w:r>
-        <w:rPr>
-          <w:lang w:val="es-MX"/>
-        </w:rPr>
-        <w:t>ChromaDB</w:t>
-      </w:r>
-      <w:proofErr w:type="spellEnd"/>
-      <w:r>
-        <w:rPr>
-          <w:lang w:val="es-MX"/>
-        </w:rPr>
-        <w:t>.</w:t>
+        <w:t>•  vectorstore.add() convierte cada fragmento en un vector (MiniLM) y lo guarda en ChromaDB.</w:t>
       </w:r>
     </w:p>
     <w:p>
@@ -883,28 +719,7 @@
           <w:sz w:val="24"/>
           <w:lang w:val="es-MX"/>
         </w:rPr>
-        <w:lastRenderedPageBreak/>
-        <w:t xml:space="preserve">B) CONSULTA — </w:t>
-      </w:r>
-      <w:proofErr w:type="gramStart"/>
-      <w:r>
-        <w:rPr>
-          <w:b/>
-          <w:color w:val="6A4C93"/>
-          <w:sz w:val="24"/>
-          <w:lang w:val="es-MX"/>
-        </w:rPr>
-        <w:t>responder  (</w:t>
-      </w:r>
-      <w:proofErr w:type="gramEnd"/>
-      <w:r>
-        <w:rPr>
-          <w:b/>
-          <w:color w:val="6A4C93"/>
-          <w:sz w:val="24"/>
-          <w:lang w:val="es-MX"/>
-        </w:rPr>
-        <w:t>rag.py)</w:t>
+        <w:t>B) CONSULTA — responder  (rag.py)</w:t>
       </w:r>
     </w:p>
     <w:p>
@@ -915,26 +730,11 @@
         <w:rPr>
           <w:lang w:val="es-MX"/>
         </w:rPr>
+        <w:lastRenderedPageBreak/>
         <w:t xml:space="preserve">Ocurre cada vez que alguien pregunta. </w:t>
       </w:r>
       <w:r>
-        <w:t xml:space="preserve">Este es </w:t>
-      </w:r>
-      <w:proofErr w:type="spellStart"/>
-      <w:r>
-        <w:t>el</w:t>
-      </w:r>
-      <w:proofErr w:type="spellEnd"/>
-      <w:r>
-        <w:t xml:space="preserve"> </w:t>
-      </w:r>
-      <w:proofErr w:type="spellStart"/>
-      <w:r>
-        <w:t>flujo</w:t>
-      </w:r>
-      <w:proofErr w:type="spellEnd"/>
-      <w:r>
-        <w:t>:</w:t>
+        <w:t>Este es el flujo:</w:t>
       </w:r>
     </w:p>
     <w:tbl>
@@ -944,7 +744,7 @@
         <w:tblLook w:val="04A0" w:firstRow="1" w:lastRow="0" w:firstColumn="1" w:lastColumn="0" w:noHBand="0" w:noVBand="1"/>
       </w:tblPr>
       <w:tblGrid>
-        <w:gridCol w:w="8640"/>
+        <w:gridCol w:w="8856"/>
       </w:tblGrid>
       <w:tr>
         <w:tc>
@@ -964,587 +764,42 @@
                 <w:sz w:val="18"/>
                 <w:lang w:val="es-MX"/>
               </w:rPr>
-              <w:t>Pregunta del estudiante</w:t>
+              <w:drawing>
+                <wp:inline distT="0" distB="0" distL="0" distR="0" wp14:anchorId="78291F57" wp14:editId="5CA43355">
+                  <wp:extent cx="5486400" cy="4337685"/>
+                  <wp:effectExtent l="0" t="0" r="0" b="0"/>
+                  <wp:docPr id="593291230" name="Imagen 1"/>
+                  <wp:cNvGraphicFramePr>
+                    <a:graphicFrameLocks xmlns:a="http://schemas.openxmlformats.org/drawingml/2006/main" noChangeAspect="1"/>
+                  </wp:cNvGraphicFramePr>
+                  <a:graphic xmlns:a="http://schemas.openxmlformats.org/drawingml/2006/main">
+                    <a:graphicData uri="http://schemas.openxmlformats.org/drawingml/2006/picture">
+                      <pic:pic xmlns:pic="http://schemas.openxmlformats.org/drawingml/2006/picture">
+                        <pic:nvPicPr>
+                          <pic:cNvPr id="593291230" name=""/>
+                          <pic:cNvPicPr/>
+                        </pic:nvPicPr>
+                        <pic:blipFill>
+                          <a:blip r:embed="rId6"/>
+                          <a:stretch>
+                            <a:fillRect/>
+                          </a:stretch>
+                        </pic:blipFill>
+                        <pic:spPr>
+                          <a:xfrm>
+                            <a:off x="0" y="0"/>
+                            <a:ext cx="5486400" cy="4337685"/>
+                          </a:xfrm>
+                          <a:prstGeom prst="rect">
+                            <a:avLst/>
+                          </a:prstGeom>
+                        </pic:spPr>
+                      </pic:pic>
+                    </a:graphicData>
+                  </a:graphic>
+                </wp:inline>
+              </w:drawing>
             </w:r>
-          </w:p>
-          <w:p>
-            <w:pPr>
-              <w:rPr>
-                <w:lang w:val="es-MX"/>
-              </w:rPr>
-            </w:pPr>
-            <w:r>
-              <w:rPr>
-                <w:rFonts w:ascii="Consolas" w:hAnsi="Consolas"/>
-                <w:sz w:val="18"/>
-                <w:lang w:val="es-MX"/>
-              </w:rPr>
-              <w:t xml:space="preserve">   |</w:t>
-            </w:r>
-          </w:p>
-          <w:p>
-            <w:pPr>
-              <w:rPr>
-                <w:lang w:val="es-MX"/>
-              </w:rPr>
-            </w:pPr>
-            <w:r>
-              <w:rPr>
-                <w:rFonts w:ascii="Consolas" w:hAnsi="Consolas"/>
-                <w:sz w:val="18"/>
-                <w:lang w:val="es-MX"/>
-              </w:rPr>
-              <w:t>1) Es saludo/ayuda?  -&gt; (</w:t>
-            </w:r>
-            <w:proofErr w:type="spellStart"/>
-            <w:r>
-              <w:rPr>
-                <w:rFonts w:ascii="Consolas" w:hAnsi="Consolas"/>
-                <w:sz w:val="18"/>
-                <w:lang w:val="es-MX"/>
-              </w:rPr>
-              <w:t>regex</w:t>
-            </w:r>
-            <w:proofErr w:type="spellEnd"/>
-            <w:r>
-              <w:rPr>
-                <w:rFonts w:ascii="Consolas" w:hAnsi="Consolas"/>
-                <w:sz w:val="18"/>
-                <w:lang w:val="es-MX"/>
-              </w:rPr>
-              <w:t xml:space="preserve">) responde con </w:t>
-            </w:r>
-            <w:proofErr w:type="spellStart"/>
-            <w:r>
-              <w:rPr>
-                <w:rFonts w:ascii="Consolas" w:hAnsi="Consolas"/>
-                <w:sz w:val="18"/>
-                <w:lang w:val="es-MX"/>
-              </w:rPr>
-              <w:t>guia</w:t>
-            </w:r>
-            <w:proofErr w:type="spellEnd"/>
-            <w:r>
-              <w:rPr>
-                <w:rFonts w:ascii="Consolas" w:hAnsi="Consolas"/>
-                <w:sz w:val="18"/>
-                <w:lang w:val="es-MX"/>
-              </w:rPr>
-              <w:t xml:space="preserve">   </w:t>
-            </w:r>
-            <w:proofErr w:type="gramStart"/>
-            <w:r>
-              <w:rPr>
-                <w:rFonts w:ascii="Consolas" w:hAnsi="Consolas"/>
-                <w:sz w:val="18"/>
-                <w:lang w:val="es-MX"/>
-              </w:rPr>
-              <w:t xml:space="preserve">   [</w:t>
-            </w:r>
-            <w:proofErr w:type="gramEnd"/>
-            <w:r>
-              <w:rPr>
-                <w:rFonts w:ascii="Consolas" w:hAnsi="Consolas"/>
-                <w:sz w:val="18"/>
-                <w:lang w:val="es-MX"/>
-              </w:rPr>
-              <w:t>no usa RAG]</w:t>
-            </w:r>
-          </w:p>
-          <w:p>
-            <w:pPr>
-              <w:rPr>
-                <w:lang w:val="es-MX"/>
-              </w:rPr>
-            </w:pPr>
-            <w:r>
-              <w:rPr>
-                <w:rFonts w:ascii="Consolas" w:hAnsi="Consolas"/>
-                <w:sz w:val="18"/>
-                <w:lang w:val="es-MX"/>
-              </w:rPr>
-              <w:t xml:space="preserve">   | no</w:t>
-            </w:r>
-          </w:p>
-          <w:p>
-            <w:pPr>
-              <w:rPr>
-                <w:lang w:val="es-MX"/>
-              </w:rPr>
-            </w:pPr>
-            <w:r>
-              <w:rPr>
-                <w:rFonts w:ascii="Consolas" w:hAnsi="Consolas"/>
-                <w:sz w:val="18"/>
-                <w:lang w:val="es-MX"/>
-              </w:rPr>
-              <w:t xml:space="preserve">2) </w:t>
-            </w:r>
-            <w:proofErr w:type="gramStart"/>
-            <w:r>
-              <w:rPr>
-                <w:rFonts w:ascii="Consolas" w:hAnsi="Consolas"/>
-                <w:sz w:val="18"/>
-                <w:lang w:val="es-MX"/>
-              </w:rPr>
-              <w:t>RECUPERAR  -</w:t>
-            </w:r>
-            <w:proofErr w:type="gramEnd"/>
-            <w:r>
-              <w:rPr>
-                <w:rFonts w:ascii="Consolas" w:hAnsi="Consolas"/>
-                <w:sz w:val="18"/>
-                <w:lang w:val="es-MX"/>
-              </w:rPr>
-              <w:t xml:space="preserve">&gt; </w:t>
-            </w:r>
-            <w:proofErr w:type="spellStart"/>
-            <w:proofErr w:type="gramStart"/>
-            <w:r>
-              <w:rPr>
-                <w:rFonts w:ascii="Consolas" w:hAnsi="Consolas"/>
-                <w:sz w:val="18"/>
-                <w:lang w:val="es-MX"/>
-              </w:rPr>
-              <w:t>vectorstore.query</w:t>
-            </w:r>
-            <w:proofErr w:type="spellEnd"/>
-            <w:proofErr w:type="gramEnd"/>
-            <w:r>
-              <w:rPr>
-                <w:rFonts w:ascii="Consolas" w:hAnsi="Consolas"/>
-                <w:sz w:val="18"/>
-                <w:lang w:val="es-MX"/>
-              </w:rPr>
-              <w:t>()</w:t>
-            </w:r>
-          </w:p>
-          <w:p>
-            <w:pPr>
-              <w:rPr>
-                <w:lang w:val="es-MX"/>
-              </w:rPr>
-            </w:pPr>
-            <w:r>
-              <w:rPr>
-                <w:rFonts w:ascii="Consolas" w:hAnsi="Consolas"/>
-                <w:sz w:val="18"/>
-                <w:lang w:val="es-MX"/>
-              </w:rPr>
-              <w:t xml:space="preserve">   </w:t>
-            </w:r>
-            <w:proofErr w:type="spellStart"/>
-            <w:r>
-              <w:rPr>
-                <w:rFonts w:ascii="Consolas" w:hAnsi="Consolas"/>
-                <w:sz w:val="18"/>
-                <w:lang w:val="es-MX"/>
-              </w:rPr>
-              <w:t>ChromaDB</w:t>
-            </w:r>
-            <w:proofErr w:type="spellEnd"/>
-            <w:r>
-              <w:rPr>
-                <w:rFonts w:ascii="Consolas" w:hAnsi="Consolas"/>
-                <w:sz w:val="18"/>
-                <w:lang w:val="es-MX"/>
-              </w:rPr>
-              <w:t xml:space="preserve"> convierte la pregunta en vector y busca los 4</w:t>
-            </w:r>
-          </w:p>
-          <w:p>
-            <w:pPr>
-              <w:rPr>
-                <w:lang w:val="es-MX"/>
-              </w:rPr>
-            </w:pPr>
-            <w:r>
-              <w:rPr>
-                <w:rFonts w:ascii="Consolas" w:hAnsi="Consolas"/>
-                <w:sz w:val="18"/>
-                <w:lang w:val="es-MX"/>
-              </w:rPr>
-              <w:t xml:space="preserve">   fragmentos </w:t>
-            </w:r>
-            <w:proofErr w:type="spellStart"/>
-            <w:r>
-              <w:rPr>
-                <w:rFonts w:ascii="Consolas" w:hAnsi="Consolas"/>
-                <w:sz w:val="18"/>
-                <w:lang w:val="es-MX"/>
-              </w:rPr>
-              <w:t>mas</w:t>
-            </w:r>
-            <w:proofErr w:type="spellEnd"/>
-            <w:r>
-              <w:rPr>
-                <w:rFonts w:ascii="Consolas" w:hAnsi="Consolas"/>
-                <w:sz w:val="18"/>
-                <w:lang w:val="es-MX"/>
-              </w:rPr>
-              <w:t xml:space="preserve"> parecidos, solo dentro del alcance.</w:t>
-            </w:r>
-          </w:p>
-          <w:p>
-            <w:pPr>
-              <w:rPr>
-                <w:lang w:val="es-MX"/>
-              </w:rPr>
-            </w:pPr>
-            <w:r>
-              <w:rPr>
-                <w:rFonts w:ascii="Consolas" w:hAnsi="Consolas"/>
-                <w:sz w:val="18"/>
-                <w:lang w:val="es-MX"/>
-              </w:rPr>
-              <w:t xml:space="preserve">   |</w:t>
-            </w:r>
-          </w:p>
-          <w:p>
-            <w:pPr>
-              <w:rPr>
-                <w:lang w:val="es-MX"/>
-              </w:rPr>
-            </w:pPr>
-            <w:r>
-              <w:rPr>
-                <w:rFonts w:ascii="Consolas" w:hAnsi="Consolas"/>
-                <w:sz w:val="18"/>
-                <w:lang w:val="es-MX"/>
-              </w:rPr>
-              <w:t>3) CONTROL ANTI-ALUCINACION</w:t>
-            </w:r>
-          </w:p>
-          <w:p>
-            <w:pPr>
-              <w:rPr>
-                <w:lang w:val="es-MX"/>
-              </w:rPr>
-            </w:pPr>
-            <w:r>
-              <w:rPr>
-                <w:rFonts w:ascii="Consolas" w:hAnsi="Consolas"/>
-                <w:sz w:val="18"/>
-                <w:lang w:val="es-MX"/>
-              </w:rPr>
-              <w:t xml:space="preserve">   </w:t>
-            </w:r>
-            <w:proofErr w:type="gramStart"/>
-            <w:r>
-              <w:rPr>
-                <w:rFonts w:ascii="Consolas" w:hAnsi="Consolas"/>
-                <w:sz w:val="18"/>
-                <w:lang w:val="es-MX"/>
-              </w:rPr>
-              <w:t>El mejor fragmento se parece lo suficiente?</w:t>
-            </w:r>
-            <w:proofErr w:type="gramEnd"/>
-            <w:r>
-              <w:rPr>
-                <w:rFonts w:ascii="Consolas" w:hAnsi="Consolas"/>
-                <w:sz w:val="18"/>
-                <w:lang w:val="es-MX"/>
-              </w:rPr>
-              <w:t xml:space="preserve"> (distancia &lt; 0.65)</w:t>
-            </w:r>
-          </w:p>
-          <w:p>
-            <w:pPr>
-              <w:rPr>
-                <w:lang w:val="es-MX"/>
-              </w:rPr>
-            </w:pPr>
-            <w:r>
-              <w:rPr>
-                <w:rFonts w:ascii="Consolas" w:hAnsi="Consolas"/>
-                <w:sz w:val="18"/>
-                <w:lang w:val="es-MX"/>
-              </w:rPr>
-              <w:t xml:space="preserve">       NO -&gt; "No tengo </w:t>
-            </w:r>
-            <w:proofErr w:type="spellStart"/>
-            <w:r>
-              <w:rPr>
-                <w:rFonts w:ascii="Consolas" w:hAnsi="Consolas"/>
-                <w:sz w:val="18"/>
-                <w:lang w:val="es-MX"/>
-              </w:rPr>
-              <w:t>informacion</w:t>
-            </w:r>
-            <w:proofErr w:type="spellEnd"/>
-            <w:r>
-              <w:rPr>
-                <w:rFonts w:ascii="Consolas" w:hAnsi="Consolas"/>
-                <w:sz w:val="18"/>
-                <w:lang w:val="es-MX"/>
-              </w:rPr>
-              <w:t xml:space="preserve">, consulta </w:t>
-            </w:r>
-            <w:proofErr w:type="spellStart"/>
-            <w:r>
-              <w:rPr>
-                <w:rFonts w:ascii="Consolas" w:hAnsi="Consolas"/>
-                <w:sz w:val="18"/>
-                <w:lang w:val="es-MX"/>
-              </w:rPr>
-              <w:t>coordinacion</w:t>
-            </w:r>
-            <w:proofErr w:type="spellEnd"/>
-            <w:proofErr w:type="gramStart"/>
-            <w:r>
-              <w:rPr>
-                <w:rFonts w:ascii="Consolas" w:hAnsi="Consolas"/>
-                <w:sz w:val="18"/>
-                <w:lang w:val="es-MX"/>
-              </w:rPr>
-              <w:t>"  [</w:t>
-            </w:r>
-            <w:proofErr w:type="gramEnd"/>
-            <w:r>
-              <w:rPr>
-                <w:rFonts w:ascii="Consolas" w:hAnsi="Consolas"/>
-                <w:sz w:val="18"/>
-                <w:lang w:val="es-MX"/>
-              </w:rPr>
-              <w:t>no inventa]</w:t>
-            </w:r>
-          </w:p>
-          <w:p>
-            <w:pPr>
-              <w:rPr>
-                <w:lang w:val="es-MX"/>
-              </w:rPr>
-            </w:pPr>
-            <w:r>
-              <w:rPr>
-                <w:rFonts w:ascii="Consolas" w:hAnsi="Consolas"/>
-                <w:sz w:val="18"/>
-                <w:lang w:val="es-MX"/>
-              </w:rPr>
-              <w:t xml:space="preserve">       SI |</w:t>
-            </w:r>
-          </w:p>
-          <w:p>
-            <w:pPr>
-              <w:rPr>
-                <w:lang w:val="es-MX"/>
-              </w:rPr>
-            </w:pPr>
-            <w:r>
-              <w:rPr>
-                <w:rFonts w:ascii="Consolas" w:hAnsi="Consolas"/>
-                <w:sz w:val="18"/>
-                <w:lang w:val="es-MX"/>
-              </w:rPr>
-              <w:t>4) PROMPT RESTRICTIVO</w:t>
-            </w:r>
-          </w:p>
-          <w:p>
-            <w:pPr>
-              <w:rPr>
-                <w:lang w:val="es-MX"/>
-              </w:rPr>
-            </w:pPr>
-            <w:r>
-              <w:rPr>
-                <w:rFonts w:ascii="Consolas" w:hAnsi="Consolas"/>
-                <w:sz w:val="18"/>
-                <w:lang w:val="es-MX"/>
-              </w:rPr>
-              <w:t xml:space="preserve">   "Responde SOLO con este contexto. Si no </w:t>
-            </w:r>
-            <w:proofErr w:type="spellStart"/>
-            <w:r>
-              <w:rPr>
-                <w:rFonts w:ascii="Consolas" w:hAnsi="Consolas"/>
-                <w:sz w:val="18"/>
-                <w:lang w:val="es-MX"/>
-              </w:rPr>
-              <w:t>esta</w:t>
-            </w:r>
-            <w:proofErr w:type="spellEnd"/>
-            <w:r>
-              <w:rPr>
-                <w:rFonts w:ascii="Consolas" w:hAnsi="Consolas"/>
-                <w:sz w:val="18"/>
-                <w:lang w:val="es-MX"/>
-              </w:rPr>
-              <w:t>, di que no</w:t>
-            </w:r>
-          </w:p>
-          <w:p>
-            <w:pPr>
-              <w:rPr>
-                <w:lang w:val="es-MX"/>
-              </w:rPr>
-            </w:pPr>
-            <w:r>
-              <w:rPr>
-                <w:rFonts w:ascii="Consolas" w:hAnsi="Consolas"/>
-                <w:sz w:val="18"/>
-                <w:lang w:val="es-MX"/>
-              </w:rPr>
-              <w:t xml:space="preserve">    sabes. Cita la fuente." + los fragmentos recuperados</w:t>
-            </w:r>
-          </w:p>
-          <w:p>
-            <w:pPr>
-              <w:rPr>
-                <w:lang w:val="es-MX"/>
-              </w:rPr>
-            </w:pPr>
-            <w:r>
-              <w:rPr>
-                <w:rFonts w:ascii="Consolas" w:hAnsi="Consolas"/>
-                <w:sz w:val="18"/>
-                <w:lang w:val="es-MX"/>
-              </w:rPr>
-              <w:t xml:space="preserve">   |</w:t>
-            </w:r>
-          </w:p>
-          <w:p>
-            <w:pPr>
-              <w:rPr>
-                <w:lang w:val="es-MX"/>
-              </w:rPr>
-            </w:pPr>
-            <w:r>
-              <w:rPr>
-                <w:rFonts w:ascii="Consolas" w:hAnsi="Consolas"/>
-                <w:sz w:val="18"/>
-                <w:lang w:val="es-MX"/>
-              </w:rPr>
-              <w:t xml:space="preserve">5) </w:t>
-            </w:r>
-            <w:proofErr w:type="gramStart"/>
-            <w:r>
-              <w:rPr>
-                <w:rFonts w:ascii="Consolas" w:hAnsi="Consolas"/>
-                <w:sz w:val="18"/>
-                <w:lang w:val="es-MX"/>
-              </w:rPr>
-              <w:t>GENERAR  -</w:t>
-            </w:r>
-            <w:proofErr w:type="gramEnd"/>
-            <w:r>
-              <w:rPr>
-                <w:rFonts w:ascii="Consolas" w:hAnsi="Consolas"/>
-                <w:sz w:val="18"/>
-                <w:lang w:val="es-MX"/>
-              </w:rPr>
-              <w:t xml:space="preserve">&gt; </w:t>
-            </w:r>
-            <w:proofErr w:type="spellStart"/>
-            <w:proofErr w:type="gramStart"/>
-            <w:r>
-              <w:rPr>
-                <w:rFonts w:ascii="Consolas" w:hAnsi="Consolas"/>
-                <w:sz w:val="18"/>
-                <w:lang w:val="es-MX"/>
-              </w:rPr>
-              <w:t>llm.generate</w:t>
-            </w:r>
-            <w:proofErr w:type="spellEnd"/>
-            <w:r>
-              <w:rPr>
-                <w:rFonts w:ascii="Consolas" w:hAnsi="Consolas"/>
-                <w:sz w:val="18"/>
-                <w:lang w:val="es-MX"/>
-              </w:rPr>
-              <w:t>()  (</w:t>
-            </w:r>
-            <w:proofErr w:type="spellStart"/>
-            <w:proofErr w:type="gramEnd"/>
-            <w:r>
-              <w:rPr>
-                <w:rFonts w:ascii="Consolas" w:hAnsi="Consolas"/>
-                <w:sz w:val="18"/>
-                <w:lang w:val="es-MX"/>
-              </w:rPr>
-              <w:t>Groq</w:t>
-            </w:r>
-            <w:proofErr w:type="spellEnd"/>
-            <w:r>
-              <w:rPr>
-                <w:rFonts w:ascii="Consolas" w:hAnsi="Consolas"/>
-                <w:sz w:val="18"/>
-                <w:lang w:val="es-MX"/>
-              </w:rPr>
-              <w:t>/Llama redacta)</w:t>
-            </w:r>
-          </w:p>
-          <w:p>
-            <w:pPr>
-              <w:rPr>
-                <w:lang w:val="es-MX"/>
-              </w:rPr>
-            </w:pPr>
-            <w:r>
-              <w:rPr>
-                <w:rFonts w:ascii="Consolas" w:hAnsi="Consolas"/>
-                <w:sz w:val="18"/>
-                <w:lang w:val="es-MX"/>
-              </w:rPr>
-              <w:t xml:space="preserve">   Si el LLM falla -&gt; muestra los </w:t>
-            </w:r>
-            <w:proofErr w:type="gramStart"/>
-            <w:r>
-              <w:rPr>
-                <w:rFonts w:ascii="Consolas" w:hAnsi="Consolas"/>
-                <w:sz w:val="18"/>
-                <w:lang w:val="es-MX"/>
-              </w:rPr>
-              <w:t>fragmentos  [</w:t>
-            </w:r>
-            <w:proofErr w:type="gramEnd"/>
-            <w:r>
-              <w:rPr>
-                <w:rFonts w:ascii="Consolas" w:hAnsi="Consolas"/>
-                <w:sz w:val="18"/>
-                <w:lang w:val="es-MX"/>
-              </w:rPr>
-              <w:t>no se rompe]</w:t>
-            </w:r>
-          </w:p>
-          <w:p>
-            <w:pPr>
-              <w:rPr>
-                <w:lang w:val="es-MX"/>
-              </w:rPr>
-            </w:pPr>
-            <w:r>
-              <w:rPr>
-                <w:rFonts w:ascii="Consolas" w:hAnsi="Consolas"/>
-                <w:sz w:val="18"/>
-                <w:lang w:val="es-MX"/>
-              </w:rPr>
-              <w:t xml:space="preserve">   |</w:t>
-            </w:r>
-          </w:p>
-          <w:p>
-            <w:pPr>
-              <w:rPr>
-                <w:lang w:val="es-MX"/>
-              </w:rPr>
-            </w:pPr>
-            <w:r>
-              <w:rPr>
-                <w:rFonts w:ascii="Consolas" w:hAnsi="Consolas"/>
-                <w:sz w:val="18"/>
-                <w:lang w:val="es-MX"/>
-              </w:rPr>
-              <w:t xml:space="preserve">6) Devuelve: respuesta + citas (archivo, pagina) + </w:t>
-            </w:r>
-            <w:proofErr w:type="spellStart"/>
-            <w:r>
-              <w:rPr>
-                <w:rFonts w:ascii="Consolas" w:hAnsi="Consolas"/>
-                <w:sz w:val="18"/>
-                <w:lang w:val="es-MX"/>
-              </w:rPr>
-              <w:t>con_respaldo</w:t>
-            </w:r>
-            <w:proofErr w:type="spellEnd"/>
           </w:p>
         </w:tc>
       </w:tr>
@@ -1568,21 +823,7 @@
         <w:rPr>
           <w:lang w:val="es-MX"/>
         </w:rPr>
-        <w:t xml:space="preserve">Luego app.py muestra la respuesta, los botones de cita (que abren el PDF) y registra la consulta anónima en </w:t>
-      </w:r>
-      <w:proofErr w:type="spellStart"/>
-      <w:r>
-        <w:rPr>
-          <w:lang w:val="es-MX"/>
-        </w:rPr>
-        <w:t>consultas.db</w:t>
-      </w:r>
-      <w:proofErr w:type="spellEnd"/>
-      <w:r>
-        <w:rPr>
-          <w:lang w:val="es-MX"/>
-        </w:rPr>
-        <w:t>.</w:t>
+        <w:t>Luego app.py muestra la respuesta, los botones de cita (que abren el PDF) y registra la consulta anónima en consultas.db.</w:t>
       </w:r>
     </w:p>
     <w:p>
@@ -1714,37 +955,12 @@
                 <w:lang w:val="es-MX"/>
               </w:rPr>
             </w:pPr>
-            <w:proofErr w:type="spellStart"/>
             <w:r>
               <w:rPr>
                 <w:sz w:val="19"/>
                 <w:lang w:val="es-MX"/>
               </w:rPr>
-              <w:t>carrera|</w:t>
-            </w:r>
-            <w:proofErr w:type="gramStart"/>
-            <w:r>
-              <w:rPr>
-                <w:sz w:val="19"/>
-                <w:lang w:val="es-MX"/>
-              </w:rPr>
-              <w:t>global</w:t>
-            </w:r>
-            <w:proofErr w:type="spellEnd"/>
-            <w:r>
-              <w:rPr>
-                <w:sz w:val="19"/>
-                <w:lang w:val="es-MX"/>
-              </w:rPr>
-              <w:t xml:space="preserve">  →</w:t>
-            </w:r>
-            <w:proofErr w:type="gramEnd"/>
-            <w:r>
-              <w:rPr>
-                <w:sz w:val="19"/>
-                <w:lang w:val="es-MX"/>
-              </w:rPr>
-              <w:t xml:space="preserve"> afecta a TODOS</w:t>
+              <w:t>carrera|global  → afecta a TODOS</w:t>
             </w:r>
           </w:p>
         </w:tc>
@@ -1755,14 +971,12 @@
             <w:tcW w:w="2880" w:type="dxa"/>
           </w:tcPr>
           <w:p>
-            <w:proofErr w:type="spellStart"/>
             <w:r>
               <w:rPr>
                 <w:sz w:val="19"/>
               </w:rPr>
               <w:t>Docente</w:t>
             </w:r>
-            <w:proofErr w:type="spellEnd"/>
           </w:p>
         </w:tc>
         <w:tc>
@@ -1788,37 +1002,12 @@
                 <w:lang w:val="es-MX"/>
               </w:rPr>
             </w:pPr>
-            <w:proofErr w:type="spellStart"/>
             <w:r>
               <w:rPr>
                 <w:sz w:val="19"/>
                 <w:lang w:val="es-MX"/>
               </w:rPr>
-              <w:t>carrera|curso</w:t>
-            </w:r>
-            <w:proofErr w:type="gramStart"/>
-            <w:r>
-              <w:rPr>
-                <w:sz w:val="19"/>
-                <w:lang w:val="es-MX"/>
-              </w:rPr>
-              <w:t>:X</w:t>
-            </w:r>
-            <w:proofErr w:type="spellEnd"/>
-            <w:r>
-              <w:rPr>
-                <w:sz w:val="19"/>
-                <w:lang w:val="es-MX"/>
-              </w:rPr>
-              <w:t xml:space="preserve">  →</w:t>
-            </w:r>
-            <w:proofErr w:type="gramEnd"/>
-            <w:r>
-              <w:rPr>
-                <w:sz w:val="19"/>
-                <w:lang w:val="es-MX"/>
-              </w:rPr>
-              <w:t xml:space="preserve"> solo ese curso</w:t>
+              <w:t>carrera|curso:X  → solo ese curso</w:t>
             </w:r>
           </w:p>
         </w:tc>
@@ -1829,14 +1018,12 @@
             <w:tcW w:w="2880" w:type="dxa"/>
           </w:tcPr>
           <w:p>
-            <w:proofErr w:type="spellStart"/>
             <w:r>
               <w:rPr>
                 <w:sz w:val="19"/>
               </w:rPr>
               <w:t>Estudiante</w:t>
             </w:r>
-            <w:proofErr w:type="spellEnd"/>
           </w:p>
         </w:tc>
         <w:tc>
@@ -1898,21 +1085,7 @@
         <w:rPr>
           <w:lang w:val="es-MX"/>
         </w:rPr>
-        <w:t xml:space="preserve">Así, un documento de un curso no se filtra al </w:t>
-      </w:r>
-      <w:proofErr w:type="spellStart"/>
-      <w:r>
-        <w:rPr>
-          <w:lang w:val="es-MX"/>
-        </w:rPr>
-        <w:t>bot</w:t>
-      </w:r>
-      <w:proofErr w:type="spellEnd"/>
-      <w:r>
-        <w:rPr>
-          <w:lang w:val="es-MX"/>
-        </w:rPr>
-        <w:t xml:space="preserve"> general. Es un solo cerebro con conocimiento por capas.</w:t>
+        <w:t>Así, un documento de un curso no se filtra al bot general. Es un solo cerebro con conocimiento por capas.</w:t>
       </w:r>
     </w:p>
     <w:p>
@@ -1929,7 +1102,16 @@
           <w:sz w:val="28"/>
           <w:lang w:val="es-MX"/>
         </w:rPr>
-        <w:t>5. Las 4 decisiones de diseño que debes defender</w:t>
+        <w:t xml:space="preserve">5. </w:t>
+      </w:r>
+      <w:r>
+        <w:rPr>
+          <w:b/>
+          <w:color w:val="1F3864"/>
+          <w:sz w:val="28"/>
+          <w:lang w:val="es-MX"/>
+        </w:rPr>
+        <w:t>Desciciones de diseño</w:t>
       </w:r>
     </w:p>
     <w:p>
@@ -1943,21 +1125,7 @@
         <w:rPr>
           <w:lang w:val="es-MX"/>
         </w:rPr>
-        <w:t xml:space="preserve">•  Arquitectura modular (adaptadores): cambiar una herramienta no afecta el resto. Lo demostraste cambiando Gemini → </w:t>
-      </w:r>
-      <w:proofErr w:type="spellStart"/>
-      <w:r>
-        <w:rPr>
-          <w:lang w:val="es-MX"/>
-        </w:rPr>
-        <w:t>Groq</w:t>
-      </w:r>
-      <w:proofErr w:type="spellEnd"/>
-      <w:r>
-        <w:rPr>
-          <w:lang w:val="es-MX"/>
-        </w:rPr>
-        <w:t xml:space="preserve"> tocando un archivo.</w:t>
+        <w:t xml:space="preserve">•  Arquitectura modular (adaptadores): cambiar una herramienta no afecta el resto. </w:t>
       </w:r>
     </w:p>
     <w:p>
@@ -1971,35 +1139,8 @@
         <w:rPr>
           <w:lang w:val="es-MX"/>
         </w:rPr>
-        <w:t xml:space="preserve">•  </w:t>
-      </w:r>
-      <w:proofErr w:type="spellStart"/>
-      <w:r>
-        <w:rPr>
-          <w:lang w:val="es-MX"/>
-        </w:rPr>
-        <w:t>Anti-alucinación</w:t>
-      </w:r>
-      <w:proofErr w:type="spellEnd"/>
-      <w:r>
-        <w:rPr>
-          <w:lang w:val="es-MX"/>
-        </w:rPr>
-        <w:t xml:space="preserve">: umbral de similitud + </w:t>
-      </w:r>
-      <w:proofErr w:type="spellStart"/>
-      <w:r>
-        <w:rPr>
-          <w:lang w:val="es-MX"/>
-        </w:rPr>
-        <w:t>prompt</w:t>
-      </w:r>
-      <w:proofErr w:type="spellEnd"/>
-      <w:r>
-        <w:rPr>
-          <w:lang w:val="es-MX"/>
-        </w:rPr>
-        <w:t xml:space="preserve"> restrictivo + citación. Si no hay respaldo, no inventa, deriva.</w:t>
+        <w:lastRenderedPageBreak/>
+        <w:t>•  Anti-alucinación: umbral de similitud + prompt restrictivo + citación. Si no hay respaldo, no inventa, deriva.</w:t>
       </w:r>
     </w:p>
     <w:p>
@@ -2027,35 +1168,19 @@
         <w:rPr>
           <w:lang w:val="es-MX"/>
         </w:rPr>
-        <w:t>•  API-</w:t>
+        <w:t xml:space="preserve">•  API-first preparado: api.py (FastAPI) expone la misma lógica por HTTP, así </w:t>
       </w:r>
-      <w:proofErr w:type="spellStart"/>
       <w:r>
         <w:rPr>
           <w:lang w:val="es-MX"/>
         </w:rPr>
-        <w:t>first</w:t>
+        <w:t>cualquier web</w:t>
       </w:r>
-      <w:proofErr w:type="spellEnd"/>
       <w:r>
         <w:rPr>
           <w:lang w:val="es-MX"/>
         </w:rPr>
-        <w:t xml:space="preserve"> preparado: api.py (</w:t>
-      </w:r>
-      <w:proofErr w:type="spellStart"/>
-      <w:r>
-        <w:rPr>
-          <w:lang w:val="es-MX"/>
-        </w:rPr>
-        <w:t>FastAPI</w:t>
-      </w:r>
-      <w:proofErr w:type="spellEnd"/>
-      <w:r>
-        <w:rPr>
-          <w:lang w:val="es-MX"/>
-        </w:rPr>
-        <w:t>) expone la misma lógica por HTTP, así la web de la U podría consumirla sin reescribir el motor.</w:t>
+        <w:t xml:space="preserve"> podría consumirla sin reescribir el motor.</w:t>
       </w:r>
     </w:p>
     <w:p>
@@ -2068,7 +1193,6 @@
           <w:color w:val="1F3864"/>
           <w:sz w:val="28"/>
         </w:rPr>
-        <w:lastRenderedPageBreak/>
         <w:t>6. Cómo conecta todo</w:t>
       </w:r>
     </w:p>
@@ -2079,7 +1203,7 @@
         <w:tblLook w:val="04A0" w:firstRow="1" w:lastRow="0" w:firstColumn="1" w:lastColumn="0" w:noHBand="0" w:noVBand="1"/>
       </w:tblPr>
       <w:tblGrid>
-        <w:gridCol w:w="8640"/>
+        <w:gridCol w:w="8856"/>
       </w:tblGrid>
       <w:tr>
         <w:tc>
@@ -2088,599 +1212,42 @@
             <w:shd w:val="clear" w:color="auto" w:fill="F2F3F5"/>
           </w:tcPr>
           <w:p>
-            <w:pPr>
-              <w:rPr>
-                <w:lang w:val="es-MX"/>
-              </w:rPr>
-            </w:pPr>
             <w:r>
-              <w:rPr>
-                <w:rFonts w:ascii="Consolas" w:hAnsi="Consolas"/>
-                <w:sz w:val="18"/>
-                <w:lang w:val="es-MX"/>
-              </w:rPr>
-              <w:t xml:space="preserve">  [</w:t>
-            </w:r>
-            <w:proofErr w:type="spellStart"/>
-            <w:r>
-              <w:rPr>
-                <w:rFonts w:ascii="Consolas" w:hAnsi="Consolas"/>
-                <w:sz w:val="18"/>
-                <w:lang w:val="es-MX"/>
-              </w:rPr>
-              <w:t>Coordinacion</w:t>
-            </w:r>
-            <w:proofErr w:type="spellEnd"/>
-            <w:r>
-              <w:rPr>
-                <w:rFonts w:ascii="Consolas" w:hAnsi="Consolas"/>
-                <w:sz w:val="18"/>
-                <w:lang w:val="es-MX"/>
-              </w:rPr>
-              <w:t xml:space="preserve">]   </w:t>
-            </w:r>
-            <w:proofErr w:type="gramStart"/>
-            <w:r>
-              <w:rPr>
-                <w:rFonts w:ascii="Consolas" w:hAnsi="Consolas"/>
-                <w:sz w:val="18"/>
-                <w:lang w:val="es-MX"/>
-              </w:rPr>
-              <w:t xml:space="preserve">   [</w:t>
-            </w:r>
-            <w:proofErr w:type="gramEnd"/>
-            <w:r>
-              <w:rPr>
-                <w:rFonts w:ascii="Consolas" w:hAnsi="Consolas"/>
-                <w:sz w:val="18"/>
-                <w:lang w:val="es-MX"/>
-              </w:rPr>
-              <w:t xml:space="preserve">Docente]       </w:t>
-            </w:r>
-            <w:proofErr w:type="gramStart"/>
-            <w:r>
-              <w:rPr>
-                <w:rFonts w:ascii="Consolas" w:hAnsi="Consolas"/>
-                <w:sz w:val="18"/>
-                <w:lang w:val="es-MX"/>
-              </w:rPr>
-              <w:t xml:space="preserve">   [</w:t>
-            </w:r>
-            <w:proofErr w:type="gramEnd"/>
-            <w:r>
-              <w:rPr>
-                <w:rFonts w:ascii="Consolas" w:hAnsi="Consolas"/>
-                <w:sz w:val="18"/>
-                <w:lang w:val="es-MX"/>
-              </w:rPr>
-              <w:t>Estudiante]</w:t>
-            </w:r>
-          </w:p>
-          <w:p>
-            <w:pPr>
-              <w:rPr>
-                <w:lang w:val="es-MX"/>
-              </w:rPr>
-            </w:pPr>
-            <w:r>
-              <w:rPr>
-                <w:rFonts w:ascii="Consolas" w:hAnsi="Consolas"/>
-                <w:sz w:val="18"/>
-                <w:lang w:val="es-MX"/>
-              </w:rPr>
-              <w:t xml:space="preserve">   sube reglamentos   sube a su curso     pregunta</w:t>
-            </w:r>
-          </w:p>
-          <w:p>
-            <w:pPr>
-              <w:rPr>
-                <w:lang w:val="es-MX"/>
-              </w:rPr>
-            </w:pPr>
-            <w:r>
-              <w:rPr>
-                <w:rFonts w:ascii="Consolas" w:hAnsi="Consolas"/>
-                <w:sz w:val="18"/>
-                <w:lang w:val="es-MX"/>
-              </w:rPr>
-              <w:t xml:space="preserve">        |                 |                   |</w:t>
-            </w:r>
-          </w:p>
-          <w:p>
-            <w:pPr>
-              <w:rPr>
-                <w:lang w:val="es-MX"/>
-              </w:rPr>
-            </w:pPr>
-            <w:r>
-              <w:rPr>
-                <w:rFonts w:ascii="Consolas" w:hAnsi="Consolas"/>
-                <w:sz w:val="18"/>
-                <w:lang w:val="es-MX"/>
-              </w:rPr>
-              <w:t xml:space="preserve">        v                 </w:t>
-            </w:r>
-            <w:proofErr w:type="spellStart"/>
-            <w:r>
-              <w:rPr>
-                <w:rFonts w:ascii="Consolas" w:hAnsi="Consolas"/>
-                <w:sz w:val="18"/>
-                <w:lang w:val="es-MX"/>
-              </w:rPr>
-              <w:t>v</w:t>
-            </w:r>
-            <w:proofErr w:type="spellEnd"/>
-            <w:r>
-              <w:rPr>
-                <w:rFonts w:ascii="Consolas" w:hAnsi="Consolas"/>
-                <w:sz w:val="18"/>
-                <w:lang w:val="es-MX"/>
-              </w:rPr>
-              <w:t xml:space="preserve">                   </w:t>
-            </w:r>
-            <w:proofErr w:type="spellStart"/>
-            <w:r>
-              <w:rPr>
-                <w:rFonts w:ascii="Consolas" w:hAnsi="Consolas"/>
-                <w:sz w:val="18"/>
-                <w:lang w:val="es-MX"/>
-              </w:rPr>
-              <w:t>v</w:t>
-            </w:r>
-            <w:proofErr w:type="spellEnd"/>
-          </w:p>
-          <w:p>
-            <w:pPr>
-              <w:rPr>
-                <w:lang w:val="es-MX"/>
-              </w:rPr>
-            </w:pPr>
-            <w:r>
-              <w:rPr>
-                <w:rFonts w:ascii="Consolas" w:hAnsi="Consolas"/>
-                <w:sz w:val="18"/>
-                <w:lang w:val="es-MX"/>
-              </w:rPr>
-              <w:t xml:space="preserve">  +-------------------------------------------------+</w:t>
-            </w:r>
-          </w:p>
-          <w:p>
-            <w:pPr>
-              <w:rPr>
-                <w:lang w:val="es-MX"/>
-              </w:rPr>
-            </w:pPr>
-            <w:r>
-              <w:rPr>
-                <w:rFonts w:ascii="Consolas" w:hAnsi="Consolas"/>
-                <w:sz w:val="18"/>
-                <w:lang w:val="es-MX"/>
-              </w:rPr>
-              <w:t xml:space="preserve">  |               app.py (</w:t>
-            </w:r>
-            <w:proofErr w:type="spellStart"/>
-            <w:proofErr w:type="gramStart"/>
-            <w:r>
-              <w:rPr>
-                <w:rFonts w:ascii="Consolas" w:hAnsi="Consolas"/>
-                <w:sz w:val="18"/>
-                <w:lang w:val="es-MX"/>
-              </w:rPr>
-              <w:t>Streamlit</w:t>
-            </w:r>
-            <w:proofErr w:type="spellEnd"/>
-            <w:r>
-              <w:rPr>
-                <w:rFonts w:ascii="Consolas" w:hAnsi="Consolas"/>
-                <w:sz w:val="18"/>
-                <w:lang w:val="es-MX"/>
-              </w:rPr>
-              <w:t xml:space="preserve">)   </w:t>
-            </w:r>
-            <w:proofErr w:type="gramEnd"/>
-            <w:r>
-              <w:rPr>
-                <w:rFonts w:ascii="Consolas" w:hAnsi="Consolas"/>
-                <w:sz w:val="18"/>
-                <w:lang w:val="es-MX"/>
-              </w:rPr>
-              <w:t xml:space="preserve">             </w:t>
-            </w:r>
-            <w:proofErr w:type="gramStart"/>
-            <w:r>
-              <w:rPr>
-                <w:rFonts w:ascii="Consolas" w:hAnsi="Consolas"/>
-                <w:sz w:val="18"/>
-                <w:lang w:val="es-MX"/>
-              </w:rPr>
-              <w:t>|  &lt;</w:t>
-            </w:r>
-            <w:proofErr w:type="gramEnd"/>
-            <w:r>
-              <w:rPr>
-                <w:rFonts w:ascii="Consolas" w:hAnsi="Consolas"/>
-                <w:sz w:val="18"/>
-                <w:lang w:val="es-MX"/>
-              </w:rPr>
-              <w:t>- o api.py (</w:t>
-            </w:r>
-            <w:proofErr w:type="spellStart"/>
-            <w:r>
-              <w:rPr>
-                <w:rFonts w:ascii="Consolas" w:hAnsi="Consolas"/>
-                <w:sz w:val="18"/>
-                <w:lang w:val="es-MX"/>
-              </w:rPr>
-              <w:t>FastAPI</w:t>
-            </w:r>
-            <w:proofErr w:type="spellEnd"/>
-            <w:r>
-              <w:rPr>
-                <w:rFonts w:ascii="Consolas" w:hAnsi="Consolas"/>
-                <w:sz w:val="18"/>
-                <w:lang w:val="es-MX"/>
-              </w:rPr>
-              <w:t>)</w:t>
-            </w:r>
-          </w:p>
-          <w:p>
-            <w:pPr>
-              <w:rPr>
-                <w:lang w:val="es-MX"/>
-              </w:rPr>
-            </w:pPr>
-            <w:r>
-              <w:rPr>
-                <w:rFonts w:ascii="Consolas" w:hAnsi="Consolas"/>
-                <w:sz w:val="18"/>
-                <w:lang w:val="es-MX"/>
-              </w:rPr>
-              <w:t xml:space="preserve">  +-------------------------------------------------+</w:t>
-            </w:r>
-          </w:p>
-          <w:p>
-            <w:pPr>
-              <w:rPr>
-                <w:lang w:val="es-MX"/>
-              </w:rPr>
-            </w:pPr>
-            <w:r>
-              <w:rPr>
-                <w:rFonts w:ascii="Consolas" w:hAnsi="Consolas"/>
-                <w:sz w:val="18"/>
-                <w:lang w:val="es-MX"/>
-              </w:rPr>
-              <w:t xml:space="preserve">        | (</w:t>
-            </w:r>
-            <w:proofErr w:type="gramStart"/>
-            <w:r>
-              <w:rPr>
-                <w:rFonts w:ascii="Consolas" w:hAnsi="Consolas"/>
-                <w:sz w:val="18"/>
-                <w:lang w:val="es-MX"/>
-              </w:rPr>
-              <w:t xml:space="preserve">subir)   </w:t>
-            </w:r>
-            <w:proofErr w:type="gramEnd"/>
-            <w:r>
-              <w:rPr>
-                <w:rFonts w:ascii="Consolas" w:hAnsi="Consolas"/>
-                <w:sz w:val="18"/>
-                <w:lang w:val="es-MX"/>
-              </w:rPr>
-              <w:t xml:space="preserve">               | (preguntar)</w:t>
-            </w:r>
-          </w:p>
-          <w:p>
-            <w:pPr>
-              <w:rPr>
-                <w:lang w:val="es-MX"/>
-              </w:rPr>
-            </w:pPr>
-            <w:r>
-              <w:rPr>
-                <w:rFonts w:ascii="Consolas" w:hAnsi="Consolas"/>
-                <w:sz w:val="18"/>
-                <w:lang w:val="es-MX"/>
-              </w:rPr>
-              <w:t xml:space="preserve">        v                          </w:t>
-            </w:r>
-            <w:proofErr w:type="spellStart"/>
-            <w:r>
-              <w:rPr>
-                <w:rFonts w:ascii="Consolas" w:hAnsi="Consolas"/>
-                <w:sz w:val="18"/>
-                <w:lang w:val="es-MX"/>
-              </w:rPr>
-              <w:t>v</w:t>
-            </w:r>
-            <w:proofErr w:type="spellEnd"/>
-          </w:p>
-          <w:p>
-            <w:pPr>
-              <w:rPr>
-                <w:lang w:val="es-MX"/>
-              </w:rPr>
-            </w:pPr>
-            <w:r>
-              <w:rPr>
-                <w:rFonts w:ascii="Consolas" w:hAnsi="Consolas"/>
-                <w:sz w:val="18"/>
-                <w:lang w:val="es-MX"/>
-              </w:rPr>
-              <w:t xml:space="preserve">   ingest.py                    rag.py   &lt;- ORQUESTADOR</w:t>
-            </w:r>
-          </w:p>
-          <w:p>
-            <w:pPr>
-              <w:rPr>
-                <w:lang w:val="es-MX"/>
-              </w:rPr>
-            </w:pPr>
-            <w:r>
-              <w:rPr>
-                <w:rFonts w:ascii="Consolas" w:hAnsi="Consolas"/>
-                <w:sz w:val="18"/>
-                <w:lang w:val="es-MX"/>
-              </w:rPr>
-              <w:t xml:space="preserve">        |                    |     |     |</w:t>
-            </w:r>
-          </w:p>
-          <w:p>
-            <w:pPr>
-              <w:rPr>
-                <w:lang w:val="es-MX"/>
-              </w:rPr>
-            </w:pPr>
-            <w:r>
-              <w:rPr>
-                <w:rFonts w:ascii="Consolas" w:hAnsi="Consolas"/>
-                <w:sz w:val="18"/>
-                <w:lang w:val="es-MX"/>
-              </w:rPr>
-              <w:t xml:space="preserve">        v                    </w:t>
-            </w:r>
-            <w:proofErr w:type="spellStart"/>
-            <w:r>
-              <w:rPr>
-                <w:rFonts w:ascii="Consolas" w:hAnsi="Consolas"/>
-                <w:sz w:val="18"/>
-                <w:lang w:val="es-MX"/>
-              </w:rPr>
-              <w:t>v</w:t>
-            </w:r>
-            <w:proofErr w:type="spellEnd"/>
-            <w:r>
-              <w:rPr>
-                <w:rFonts w:ascii="Consolas" w:hAnsi="Consolas"/>
-                <w:sz w:val="18"/>
-                <w:lang w:val="es-MX"/>
-              </w:rPr>
-              <w:t xml:space="preserve">     </w:t>
-            </w:r>
-            <w:proofErr w:type="spellStart"/>
-            <w:r>
-              <w:rPr>
-                <w:rFonts w:ascii="Consolas" w:hAnsi="Consolas"/>
-                <w:sz w:val="18"/>
-                <w:lang w:val="es-MX"/>
-              </w:rPr>
-              <w:t>v</w:t>
-            </w:r>
-            <w:proofErr w:type="spellEnd"/>
-            <w:r>
-              <w:rPr>
-                <w:rFonts w:ascii="Consolas" w:hAnsi="Consolas"/>
-                <w:sz w:val="18"/>
-                <w:lang w:val="es-MX"/>
-              </w:rPr>
-              <w:t xml:space="preserve">     </w:t>
-            </w:r>
-            <w:proofErr w:type="spellStart"/>
-            <w:r>
-              <w:rPr>
-                <w:rFonts w:ascii="Consolas" w:hAnsi="Consolas"/>
-                <w:sz w:val="18"/>
-                <w:lang w:val="es-MX"/>
-              </w:rPr>
-              <w:t>v</w:t>
-            </w:r>
-            <w:proofErr w:type="spellEnd"/>
-          </w:p>
-          <w:p>
-            <w:pPr>
-              <w:rPr>
-                <w:lang w:val="es-MX"/>
-              </w:rPr>
-            </w:pPr>
-            <w:r>
-              <w:rPr>
-                <w:rFonts w:ascii="Consolas" w:hAnsi="Consolas"/>
-                <w:sz w:val="18"/>
-                <w:lang w:val="es-MX"/>
-              </w:rPr>
-              <w:t xml:space="preserve">   </w:t>
-            </w:r>
-            <w:proofErr w:type="spellStart"/>
-            <w:r>
-              <w:rPr>
-                <w:rFonts w:ascii="Consolas" w:hAnsi="Consolas"/>
-                <w:sz w:val="18"/>
-                <w:lang w:val="es-MX"/>
-              </w:rPr>
-              <w:t>pdfreader</w:t>
-            </w:r>
-            <w:proofErr w:type="spellEnd"/>
-            <w:r>
-              <w:rPr>
-                <w:rFonts w:ascii="Consolas" w:hAnsi="Consolas"/>
-                <w:sz w:val="18"/>
-                <w:lang w:val="es-MX"/>
-              </w:rPr>
-              <w:t xml:space="preserve">        </w:t>
-            </w:r>
-            <w:proofErr w:type="spellStart"/>
-            <w:proofErr w:type="gramStart"/>
-            <w:r>
-              <w:rPr>
-                <w:rFonts w:ascii="Consolas" w:hAnsi="Consolas"/>
-                <w:sz w:val="18"/>
-                <w:lang w:val="es-MX"/>
-              </w:rPr>
-              <w:t>vectorstore</w:t>
-            </w:r>
-            <w:proofErr w:type="spellEnd"/>
-            <w:r>
-              <w:rPr>
-                <w:rFonts w:ascii="Consolas" w:hAnsi="Consolas"/>
-                <w:sz w:val="18"/>
-                <w:lang w:val="es-MX"/>
-              </w:rPr>
-              <w:t xml:space="preserve">  (busca)  </w:t>
-            </w:r>
-            <w:proofErr w:type="spellStart"/>
-            <w:r>
-              <w:rPr>
-                <w:rFonts w:ascii="Consolas" w:hAnsi="Consolas"/>
-                <w:sz w:val="18"/>
-                <w:lang w:val="es-MX"/>
-              </w:rPr>
-              <w:t>llm</w:t>
-            </w:r>
-            <w:proofErr w:type="spellEnd"/>
-            <w:proofErr w:type="gramEnd"/>
-          </w:p>
-          <w:p>
-            <w:pPr>
-              <w:rPr>
-                <w:lang w:val="es-MX"/>
-              </w:rPr>
-            </w:pPr>
-            <w:r>
-              <w:rPr>
-                <w:rFonts w:ascii="Consolas" w:hAnsi="Consolas"/>
-                <w:sz w:val="18"/>
-                <w:lang w:val="es-MX"/>
-              </w:rPr>
-              <w:t xml:space="preserve">   (</w:t>
-            </w:r>
-            <w:proofErr w:type="spellStart"/>
-            <w:proofErr w:type="gramStart"/>
-            <w:r>
-              <w:rPr>
-                <w:rFonts w:ascii="Consolas" w:hAnsi="Consolas"/>
-                <w:sz w:val="18"/>
-                <w:lang w:val="es-MX"/>
-              </w:rPr>
-              <w:t>PyMuPDF</w:t>
-            </w:r>
-            <w:proofErr w:type="spellEnd"/>
-            <w:r>
-              <w:rPr>
-                <w:rFonts w:ascii="Consolas" w:hAnsi="Consolas"/>
-                <w:sz w:val="18"/>
-                <w:lang w:val="es-MX"/>
-              </w:rPr>
-              <w:t xml:space="preserve">)   </w:t>
-            </w:r>
-            <w:proofErr w:type="gramEnd"/>
-            <w:r>
-              <w:rPr>
-                <w:rFonts w:ascii="Consolas" w:hAnsi="Consolas"/>
-                <w:sz w:val="18"/>
-                <w:lang w:val="es-MX"/>
-              </w:rPr>
-              <w:t xml:space="preserve">  </w:t>
-            </w:r>
-            <w:proofErr w:type="gramStart"/>
-            <w:r>
-              <w:rPr>
-                <w:rFonts w:ascii="Consolas" w:hAnsi="Consolas"/>
-                <w:sz w:val="18"/>
-                <w:lang w:val="es-MX"/>
-              </w:rPr>
-              <w:t xml:space="preserve">   (</w:t>
-            </w:r>
-            <w:proofErr w:type="spellStart"/>
-            <w:r>
-              <w:rPr>
-                <w:rFonts w:ascii="Consolas" w:hAnsi="Consolas"/>
-                <w:sz w:val="18"/>
-                <w:lang w:val="es-MX"/>
-              </w:rPr>
-              <w:t>ChromaDB</w:t>
-            </w:r>
-            <w:proofErr w:type="spellEnd"/>
-            <w:r>
-              <w:rPr>
-                <w:rFonts w:ascii="Consolas" w:hAnsi="Consolas"/>
-                <w:sz w:val="18"/>
-                <w:lang w:val="es-MX"/>
-              </w:rPr>
-              <w:t xml:space="preserve">)   </w:t>
-            </w:r>
-            <w:proofErr w:type="gramEnd"/>
-            <w:r>
-              <w:rPr>
-                <w:rFonts w:ascii="Consolas" w:hAnsi="Consolas"/>
-                <w:sz w:val="18"/>
-                <w:lang w:val="es-MX"/>
-              </w:rPr>
-              <w:t xml:space="preserve">      </w:t>
-            </w:r>
-            <w:proofErr w:type="gramStart"/>
-            <w:r>
-              <w:rPr>
-                <w:rFonts w:ascii="Consolas" w:hAnsi="Consolas"/>
-                <w:sz w:val="18"/>
-                <w:lang w:val="es-MX"/>
-              </w:rPr>
-              <w:t xml:space="preserve">   (</w:t>
-            </w:r>
-            <w:proofErr w:type="spellStart"/>
-            <w:proofErr w:type="gramEnd"/>
-            <w:r>
-              <w:rPr>
-                <w:rFonts w:ascii="Consolas" w:hAnsi="Consolas"/>
-                <w:sz w:val="18"/>
-                <w:lang w:val="es-MX"/>
-              </w:rPr>
-              <w:t>Groq</w:t>
-            </w:r>
-            <w:proofErr w:type="spellEnd"/>
-            <w:r>
-              <w:rPr>
-                <w:rFonts w:ascii="Consolas" w:hAnsi="Consolas"/>
-                <w:sz w:val="18"/>
-                <w:lang w:val="es-MX"/>
-              </w:rPr>
-              <w:t>/Llama)</w:t>
-            </w:r>
-          </w:p>
-          <w:p>
-            <w:r>
-              <w:rPr>
-                <w:rFonts w:ascii="Consolas" w:hAnsi="Consolas"/>
-                <w:sz w:val="18"/>
-                <w:lang w:val="es-MX"/>
-              </w:rPr>
-              <w:t xml:space="preserve">                        </w:t>
-            </w:r>
-            <w:r>
-              <w:rPr>
-                <w:rFonts w:ascii="Consolas" w:hAnsi="Consolas"/>
-                <w:sz w:val="18"/>
-              </w:rPr>
-              <w:t>^</w:t>
-            </w:r>
-          </w:p>
-          <w:p>
-            <w:r>
-              <w:rPr>
-                <w:rFonts w:ascii="Consolas" w:hAnsi="Consolas"/>
-                <w:sz w:val="18"/>
-              </w:rPr>
-              <w:t xml:space="preserve">                  embeddings (MiniLM)</w:t>
+              <w:drawing>
+                <wp:inline distT="0" distB="0" distL="0" distR="0" wp14:anchorId="7127E01B" wp14:editId="21CD578F">
+                  <wp:extent cx="5486400" cy="3622040"/>
+                  <wp:effectExtent l="0" t="0" r="0" b="0"/>
+                  <wp:docPr id="1182106899" name="Imagen 1"/>
+                  <wp:cNvGraphicFramePr>
+                    <a:graphicFrameLocks xmlns:a="http://schemas.openxmlformats.org/drawingml/2006/main" noChangeAspect="1"/>
+                  </wp:cNvGraphicFramePr>
+                  <a:graphic xmlns:a="http://schemas.openxmlformats.org/drawingml/2006/main">
+                    <a:graphicData uri="http://schemas.openxmlformats.org/drawingml/2006/picture">
+                      <pic:pic xmlns:pic="http://schemas.openxmlformats.org/drawingml/2006/picture">
+                        <pic:nvPicPr>
+                          <pic:cNvPr id="1182106899" name=""/>
+                          <pic:cNvPicPr/>
+                        </pic:nvPicPr>
+                        <pic:blipFill>
+                          <a:blip r:embed="rId7"/>
+                          <a:stretch>
+                            <a:fillRect/>
+                          </a:stretch>
+                        </pic:blipFill>
+                        <pic:spPr>
+                          <a:xfrm>
+                            <a:off x="0" y="0"/>
+                            <a:ext cx="5486400" cy="3622040"/>
+                          </a:xfrm>
+                          <a:prstGeom prst="rect">
+                            <a:avLst/>
+                          </a:prstGeom>
+                        </pic:spPr>
+                      </pic:pic>
+                    </a:graphicData>
+                  </a:graphic>
+                </wp:inline>
+              </w:drawing>
             </w:r>
           </w:p>
         </w:tc>
@@ -2694,829 +1261,72 @@
     <w:p>
       <w:pPr>
         <w:spacing w:before="280" w:after="80"/>
+      </w:pPr>
+      <w:r>
+        <w:rPr>
+          <w:b/>
+          <w:color w:val="1F3864"/>
+          <w:sz w:val="28"/>
+        </w:rPr>
+        <w:t xml:space="preserve">6. </w:t>
+      </w:r>
+      <w:r>
+        <w:rPr>
+          <w:b/>
+          <w:color w:val="1F3864"/>
+          <w:sz w:val="28"/>
+        </w:rPr>
+        <w:t>Coseno  para similitudes</w:t>
+      </w:r>
+    </w:p>
+    <w:p>
+      <w:pPr>
+        <w:jc w:val="center"/>
         <w:rPr>
           <w:lang w:val="es-MX"/>
         </w:rPr>
       </w:pPr>
       <w:r>
         <w:rPr>
-          <w:b/>
-          <w:color w:val="1F3864"/>
-          <w:sz w:val="28"/>
           <w:lang w:val="es-MX"/>
         </w:rPr>
-        <w:t>7. Glosario rápido (por si preguntan)</w:t>
+        <w:lastRenderedPageBreak/>
+        <w:drawing>
+          <wp:inline distT="0" distB="0" distL="0" distR="0" wp14:anchorId="117F5504" wp14:editId="473CD7FD">
+            <wp:extent cx="5806727" cy="2889250"/>
+            <wp:effectExtent l="0" t="0" r="0" b="0"/>
+            <wp:docPr id="291388033" name="Imagen 1"/>
+            <wp:cNvGraphicFramePr>
+              <a:graphicFrameLocks xmlns:a="http://schemas.openxmlformats.org/drawingml/2006/main" noChangeAspect="1"/>
+            </wp:cNvGraphicFramePr>
+            <a:graphic xmlns:a="http://schemas.openxmlformats.org/drawingml/2006/main">
+              <a:graphicData uri="http://schemas.openxmlformats.org/drawingml/2006/picture">
+                <pic:pic xmlns:pic="http://schemas.openxmlformats.org/drawingml/2006/picture">
+                  <pic:nvPicPr>
+                    <pic:cNvPr id="291388033" name=""/>
+                    <pic:cNvPicPr/>
+                  </pic:nvPicPr>
+                  <pic:blipFill>
+                    <a:blip r:embed="rId8"/>
+                    <a:stretch>
+                      <a:fillRect/>
+                    </a:stretch>
+                  </pic:blipFill>
+                  <pic:spPr>
+                    <a:xfrm>
+                      <a:off x="0" y="0"/>
+                      <a:ext cx="5807698" cy="2889733"/>
+                    </a:xfrm>
+                    <a:prstGeom prst="rect">
+                      <a:avLst/>
+                    </a:prstGeom>
+                  </pic:spPr>
+                </pic:pic>
+              </a:graphicData>
+            </a:graphic>
+          </wp:inline>
+        </w:drawing>
       </w:r>
-    </w:p>
-    <w:tbl>
-      <w:tblPr>
-        <w:tblStyle w:val="Tablaconcuadrcula"/>
-        <w:tblW w:w="0" w:type="auto"/>
-        <w:tblLook w:val="04A0" w:firstRow="1" w:lastRow="0" w:firstColumn="1" w:lastColumn="0" w:noHBand="0" w:noVBand="1"/>
-      </w:tblPr>
-      <w:tblGrid>
-        <w:gridCol w:w="4320"/>
-        <w:gridCol w:w="4320"/>
-      </w:tblGrid>
-      <w:tr>
-        <w:tc>
-          <w:tcPr>
-            <w:tcW w:w="4320" w:type="dxa"/>
-            <w:shd w:val="clear" w:color="auto" w:fill="1F3864"/>
-          </w:tcPr>
-          <w:p>
-            <w:proofErr w:type="spellStart"/>
-            <w:r>
-              <w:rPr>
-                <w:b/>
-                <w:color w:val="FFFFFF"/>
-                <w:sz w:val="20"/>
-              </w:rPr>
-              <w:t>Término</w:t>
-            </w:r>
-            <w:proofErr w:type="spellEnd"/>
-          </w:p>
-        </w:tc>
-        <w:tc>
-          <w:tcPr>
-            <w:tcW w:w="4320" w:type="dxa"/>
-            <w:shd w:val="clear" w:color="auto" w:fill="1F3864"/>
-          </w:tcPr>
-          <w:p>
-            <w:pPr>
-              <w:rPr>
-                <w:lang w:val="es-MX"/>
-              </w:rPr>
-            </w:pPr>
-            <w:r>
-              <w:rPr>
-                <w:b/>
-                <w:color w:val="FFFFFF"/>
-                <w:sz w:val="20"/>
-                <w:lang w:val="es-MX"/>
-              </w:rPr>
-              <w:t>Qué es en palabras simples</w:t>
-            </w:r>
-          </w:p>
-        </w:tc>
-      </w:tr>
-      <w:tr>
-        <w:tc>
-          <w:tcPr>
-            <w:tcW w:w="4320" w:type="dxa"/>
-          </w:tcPr>
-          <w:p>
-            <w:r>
-              <w:rPr>
-                <w:sz w:val="19"/>
-              </w:rPr>
-              <w:t>RAG</w:t>
-            </w:r>
-          </w:p>
-        </w:tc>
-        <w:tc>
-          <w:tcPr>
-            <w:tcW w:w="4320" w:type="dxa"/>
-          </w:tcPr>
-          <w:p>
-            <w:r>
-              <w:rPr>
-                <w:sz w:val="19"/>
-                <w:lang w:val="es-MX"/>
-              </w:rPr>
-              <w:t xml:space="preserve">Recuperar documentos + generar la respuesta con ellos. </w:t>
-            </w:r>
-            <w:r>
-              <w:rPr>
-                <w:sz w:val="19"/>
-              </w:rPr>
-              <w:t xml:space="preserve">Examen a </w:t>
-            </w:r>
-            <w:proofErr w:type="spellStart"/>
-            <w:r>
-              <w:rPr>
-                <w:sz w:val="19"/>
-              </w:rPr>
-              <w:t>libro</w:t>
-            </w:r>
-            <w:proofErr w:type="spellEnd"/>
-            <w:r>
-              <w:rPr>
-                <w:sz w:val="19"/>
-              </w:rPr>
-              <w:t xml:space="preserve"> </w:t>
-            </w:r>
-            <w:proofErr w:type="spellStart"/>
-            <w:r>
-              <w:rPr>
-                <w:sz w:val="19"/>
-              </w:rPr>
-              <w:t>abierto</w:t>
-            </w:r>
-            <w:proofErr w:type="spellEnd"/>
-            <w:r>
-              <w:rPr>
-                <w:sz w:val="19"/>
-              </w:rPr>
-              <w:t>.</w:t>
-            </w:r>
-          </w:p>
-        </w:tc>
-      </w:tr>
-      <w:tr>
-        <w:tc>
-          <w:tcPr>
-            <w:tcW w:w="4320" w:type="dxa"/>
-          </w:tcPr>
-          <w:p>
-            <w:r>
-              <w:rPr>
-                <w:sz w:val="19"/>
-              </w:rPr>
-              <w:t>Embedding</w:t>
-            </w:r>
-          </w:p>
-        </w:tc>
-        <w:tc>
-          <w:tcPr>
-            <w:tcW w:w="4320" w:type="dxa"/>
-          </w:tcPr>
-          <w:p>
-            <w:pPr>
-              <w:rPr>
-                <w:lang w:val="es-MX"/>
-              </w:rPr>
-            </w:pPr>
-            <w:r>
-              <w:rPr>
-                <w:sz w:val="19"/>
-                <w:lang w:val="es-MX"/>
-              </w:rPr>
-              <w:t>Convertir un texto en una lista de números que captura su significado.</w:t>
-            </w:r>
-          </w:p>
-        </w:tc>
-      </w:tr>
-      <w:tr>
-        <w:tc>
-          <w:tcPr>
-            <w:tcW w:w="4320" w:type="dxa"/>
-          </w:tcPr>
-          <w:p>
-            <w:r>
-              <w:rPr>
-                <w:sz w:val="19"/>
-              </w:rPr>
-              <w:t>Vector / base vectorial</w:t>
-            </w:r>
-          </w:p>
-        </w:tc>
-        <w:tc>
-          <w:tcPr>
-            <w:tcW w:w="4320" w:type="dxa"/>
-          </w:tcPr>
-          <w:p>
-            <w:pPr>
-              <w:rPr>
-                <w:lang w:val="es-MX"/>
-              </w:rPr>
-            </w:pPr>
-            <w:r>
-              <w:rPr>
-                <w:sz w:val="19"/>
-                <w:lang w:val="es-MX"/>
-              </w:rPr>
-              <w:t xml:space="preserve">Esos números; </w:t>
-            </w:r>
-            <w:proofErr w:type="spellStart"/>
-            <w:r>
-              <w:rPr>
-                <w:sz w:val="19"/>
-                <w:lang w:val="es-MX"/>
-              </w:rPr>
-              <w:t>ChromaDB</w:t>
-            </w:r>
-            <w:proofErr w:type="spellEnd"/>
-            <w:r>
-              <w:rPr>
-                <w:sz w:val="19"/>
-                <w:lang w:val="es-MX"/>
-              </w:rPr>
-              <w:t xml:space="preserve"> los guarda y busca los más parecidos.</w:t>
-            </w:r>
-          </w:p>
-        </w:tc>
-      </w:tr>
-      <w:tr>
-        <w:tc>
-          <w:tcPr>
-            <w:tcW w:w="4320" w:type="dxa"/>
-          </w:tcPr>
-          <w:p>
-            <w:r>
-              <w:rPr>
-                <w:sz w:val="19"/>
-              </w:rPr>
-              <w:t>Chunk (</w:t>
-            </w:r>
-            <w:proofErr w:type="spellStart"/>
-            <w:r>
-              <w:rPr>
-                <w:sz w:val="19"/>
-              </w:rPr>
-              <w:t>fragmento</w:t>
-            </w:r>
-            <w:proofErr w:type="spellEnd"/>
-            <w:r>
-              <w:rPr>
-                <w:sz w:val="19"/>
-              </w:rPr>
-              <w:t>)</w:t>
-            </w:r>
-          </w:p>
-        </w:tc>
-        <w:tc>
-          <w:tcPr>
-            <w:tcW w:w="4320" w:type="dxa"/>
-          </w:tcPr>
-          <w:p>
-            <w:pPr>
-              <w:rPr>
-                <w:lang w:val="es-MX"/>
-              </w:rPr>
-            </w:pPr>
-            <w:r>
-              <w:rPr>
-                <w:sz w:val="19"/>
-                <w:lang w:val="es-MX"/>
-              </w:rPr>
-              <w:t>Un pedazo del documento (~500 caracteres) para recuperar con precisión.</w:t>
-            </w:r>
-          </w:p>
-        </w:tc>
-      </w:tr>
-      <w:tr>
-        <w:tc>
-          <w:tcPr>
-            <w:tcW w:w="4320" w:type="dxa"/>
-          </w:tcPr>
-          <w:p>
-            <w:proofErr w:type="spellStart"/>
-            <w:r>
-              <w:rPr>
-                <w:sz w:val="19"/>
-              </w:rPr>
-              <w:t>Alcance</w:t>
-            </w:r>
-            <w:proofErr w:type="spellEnd"/>
-            <w:r>
-              <w:rPr>
-                <w:sz w:val="19"/>
-              </w:rPr>
-              <w:t xml:space="preserve"> (scope)</w:t>
-            </w:r>
-          </w:p>
-        </w:tc>
-        <w:tc>
-          <w:tcPr>
-            <w:tcW w:w="4320" w:type="dxa"/>
-          </w:tcPr>
-          <w:p>
-            <w:pPr>
-              <w:rPr>
-                <w:lang w:val="es-MX"/>
-              </w:rPr>
-            </w:pPr>
-            <w:r>
-              <w:rPr>
-                <w:sz w:val="19"/>
-                <w:lang w:val="es-MX"/>
-              </w:rPr>
-              <w:t>La etiqueta que dice si un documento es global o de un curso.</w:t>
-            </w:r>
-          </w:p>
-        </w:tc>
-      </w:tr>
-      <w:tr>
-        <w:tc>
-          <w:tcPr>
-            <w:tcW w:w="4320" w:type="dxa"/>
-          </w:tcPr>
-          <w:p>
-            <w:r>
-              <w:rPr>
-                <w:sz w:val="19"/>
-              </w:rPr>
-              <w:t xml:space="preserve">Umbral de </w:t>
-            </w:r>
-            <w:proofErr w:type="spellStart"/>
-            <w:r>
-              <w:rPr>
-                <w:sz w:val="19"/>
-              </w:rPr>
-              <w:t>similitud</w:t>
-            </w:r>
-            <w:proofErr w:type="spellEnd"/>
-          </w:p>
-        </w:tc>
-        <w:tc>
-          <w:tcPr>
-            <w:tcW w:w="4320" w:type="dxa"/>
-          </w:tcPr>
-          <w:p>
-            <w:pPr>
-              <w:rPr>
-                <w:lang w:val="es-MX"/>
-              </w:rPr>
-            </w:pPr>
-            <w:r>
-              <w:rPr>
-                <w:sz w:val="19"/>
-                <w:lang w:val="es-MX"/>
-              </w:rPr>
-              <w:t>Qué tan parecido debe ser un fragmento para considerarlo respaldo.</w:t>
-            </w:r>
-          </w:p>
-        </w:tc>
-      </w:tr>
-    </w:tbl>
-    <w:p>
-      <w:pPr>
-        <w:spacing w:after="40"/>
-        <w:rPr>
-          <w:lang w:val="es-MX"/>
-        </w:rPr>
-      </w:pPr>
-    </w:p>
-    <w:p>
-      <w:pPr>
-        <w:spacing w:before="280" w:after="80"/>
-        <w:rPr>
-          <w:lang w:val="es-MX"/>
-        </w:rPr>
-      </w:pPr>
-      <w:r>
-        <w:rPr>
-          <w:b/>
-          <w:color w:val="1F3864"/>
-          <w:sz w:val="28"/>
-          <w:lang w:val="es-MX"/>
-        </w:rPr>
-        <w:t>8. Tu guion de 30 segundos</w:t>
-      </w:r>
-    </w:p>
-    <w:p>
-      <w:pPr>
-        <w:rPr>
-          <w:lang w:val="es-MX"/>
-        </w:rPr>
-      </w:pPr>
-      <w:r>
-        <w:rPr>
-          <w:i/>
-          <w:lang w:val="es-MX"/>
-        </w:rPr>
-        <w:t>Es un asistente RAG: cuando un estudiante pregunta, el sistema recupera los fragmentos más parecidos de los documentos oficiales, verifica que haya respaldo suficiente, y un modelo de lenguaje redacta la respuesta citando la fuente. Si no hay respaldo, no inventa. Diseñé la arquitectura modular por adaptadores, así puedo cambiar el modelo, la base vectorial o el lector de PDF sin afectar el resto. El conocimiento está por capas: coordinación sube reglamentos globales y cada docente sube los documentos de su curso.</w:t>
-      </w:r>
-    </w:p>
-    <w:p>
-      <w:pPr>
-        <w:spacing w:before="280" w:after="80"/>
-        <w:rPr>
-          <w:lang w:val="es-MX"/>
-        </w:rPr>
-      </w:pPr>
-      <w:r>
-        <w:rPr>
-          <w:b/>
-          <w:color w:val="1F3864"/>
-          <w:sz w:val="28"/>
-          <w:lang w:val="es-MX"/>
-        </w:rPr>
-        <w:t>9. Preguntas que te pueden hacer (y cómo responder)</w:t>
-      </w:r>
-    </w:p>
-    <w:tbl>
-      <w:tblPr>
-        <w:tblStyle w:val="Tablaconcuadrcula"/>
-        <w:tblW w:w="0" w:type="auto"/>
-        <w:tblLook w:val="04A0" w:firstRow="1" w:lastRow="0" w:firstColumn="1" w:lastColumn="0" w:noHBand="0" w:noVBand="1"/>
-      </w:tblPr>
-      <w:tblGrid>
-        <w:gridCol w:w="4320"/>
-        <w:gridCol w:w="4320"/>
-      </w:tblGrid>
-      <w:tr>
-        <w:tc>
-          <w:tcPr>
-            <w:tcW w:w="4320" w:type="dxa"/>
-            <w:shd w:val="clear" w:color="auto" w:fill="1F3864"/>
-          </w:tcPr>
-          <w:p>
-            <w:proofErr w:type="spellStart"/>
-            <w:r>
-              <w:rPr>
-                <w:b/>
-                <w:color w:val="FFFFFF"/>
-                <w:sz w:val="20"/>
-              </w:rPr>
-              <w:t>Pregunta</w:t>
-            </w:r>
-            <w:proofErr w:type="spellEnd"/>
-          </w:p>
-        </w:tc>
-        <w:tc>
-          <w:tcPr>
-            <w:tcW w:w="4320" w:type="dxa"/>
-            <w:shd w:val="clear" w:color="auto" w:fill="1F3864"/>
-          </w:tcPr>
-          <w:p>
-            <w:r>
-              <w:rPr>
-                <w:b/>
-                <w:color w:val="FFFFFF"/>
-                <w:sz w:val="20"/>
-              </w:rPr>
-              <w:t>Respuesta corta</w:t>
-            </w:r>
-          </w:p>
-        </w:tc>
-      </w:tr>
-      <w:tr>
-        <w:tc>
-          <w:tcPr>
-            <w:tcW w:w="4320" w:type="dxa"/>
-          </w:tcPr>
-          <w:p>
-            <w:r>
-              <w:rPr>
-                <w:sz w:val="19"/>
-              </w:rPr>
-              <w:t>¿Cómo evita inventar?</w:t>
-            </w:r>
-          </w:p>
-        </w:tc>
-        <w:tc>
-          <w:tcPr>
-            <w:tcW w:w="4320" w:type="dxa"/>
-          </w:tcPr>
-          <w:p>
-            <w:pPr>
-              <w:rPr>
-                <w:lang w:val="es-MX"/>
-              </w:rPr>
-            </w:pPr>
-            <w:r>
-              <w:rPr>
-                <w:sz w:val="19"/>
-                <w:lang w:val="es-MX"/>
-              </w:rPr>
-              <w:t xml:space="preserve">Umbral de similitud + </w:t>
-            </w:r>
-            <w:proofErr w:type="spellStart"/>
-            <w:r>
-              <w:rPr>
-                <w:sz w:val="19"/>
-                <w:lang w:val="es-MX"/>
-              </w:rPr>
-              <w:t>prompt</w:t>
-            </w:r>
-            <w:proofErr w:type="spellEnd"/>
-            <w:r>
-              <w:rPr>
-                <w:sz w:val="19"/>
-                <w:lang w:val="es-MX"/>
-              </w:rPr>
-              <w:t xml:space="preserve"> restrictivo + citación; sin respaldo, deriva.</w:t>
-            </w:r>
-          </w:p>
-        </w:tc>
-      </w:tr>
-      <w:tr>
-        <w:tc>
-          <w:tcPr>
-            <w:tcW w:w="4320" w:type="dxa"/>
-          </w:tcPr>
-          <w:p>
-            <w:r>
-              <w:rPr>
-                <w:sz w:val="19"/>
-              </w:rPr>
-              <w:t>¿</w:t>
-            </w:r>
-            <w:proofErr w:type="spellStart"/>
-            <w:r>
-              <w:rPr>
-                <w:sz w:val="19"/>
-              </w:rPr>
-              <w:t>Entrenaste</w:t>
-            </w:r>
-            <w:proofErr w:type="spellEnd"/>
-            <w:r>
-              <w:rPr>
-                <w:sz w:val="19"/>
-              </w:rPr>
-              <w:t xml:space="preserve"> un </w:t>
-            </w:r>
-            <w:proofErr w:type="spellStart"/>
-            <w:r>
-              <w:rPr>
-                <w:sz w:val="19"/>
-              </w:rPr>
-              <w:t>modelo</w:t>
-            </w:r>
-            <w:proofErr w:type="spellEnd"/>
-            <w:r>
-              <w:rPr>
-                <w:sz w:val="19"/>
-              </w:rPr>
-              <w:t>?</w:t>
-            </w:r>
-          </w:p>
-        </w:tc>
-        <w:tc>
-          <w:tcPr>
-            <w:tcW w:w="4320" w:type="dxa"/>
-          </w:tcPr>
-          <w:p>
-            <w:pPr>
-              <w:rPr>
-                <w:lang w:val="es-MX"/>
-              </w:rPr>
-            </w:pPr>
-            <w:r>
-              <w:rPr>
-                <w:sz w:val="19"/>
-                <w:lang w:val="es-MX"/>
-              </w:rPr>
-              <w:t>No. Es RAG: no se entrena, se indexan los documentos y se recupera.</w:t>
-            </w:r>
-          </w:p>
-        </w:tc>
-      </w:tr>
-      <w:tr>
-        <w:tc>
-          <w:tcPr>
-            <w:tcW w:w="4320" w:type="dxa"/>
-          </w:tcPr>
-          <w:p>
-            <w:pPr>
-              <w:rPr>
-                <w:lang w:val="es-MX"/>
-              </w:rPr>
-            </w:pPr>
-            <w:r>
-              <w:rPr>
-                <w:sz w:val="19"/>
-                <w:lang w:val="es-MX"/>
-              </w:rPr>
-              <w:lastRenderedPageBreak/>
-              <w:t>¿Y si cambias de herramienta?</w:t>
-            </w:r>
-          </w:p>
-        </w:tc>
-        <w:tc>
-          <w:tcPr>
-            <w:tcW w:w="4320" w:type="dxa"/>
-          </w:tcPr>
-          <w:p>
-            <w:pPr>
-              <w:rPr>
-                <w:lang w:val="es-MX"/>
-              </w:rPr>
-            </w:pPr>
-            <w:r>
-              <w:rPr>
-                <w:sz w:val="19"/>
-                <w:lang w:val="es-MX"/>
-              </w:rPr>
-              <w:t>La arquitectura es modular; cambio el adaptador y nada más se entera.</w:t>
-            </w:r>
-          </w:p>
-        </w:tc>
-      </w:tr>
-      <w:tr>
-        <w:tc>
-          <w:tcPr>
-            <w:tcW w:w="4320" w:type="dxa"/>
-          </w:tcPr>
-          <w:p>
-            <w:pPr>
-              <w:rPr>
-                <w:lang w:val="es-MX"/>
-              </w:rPr>
-            </w:pPr>
-            <w:r>
-              <w:rPr>
-                <w:sz w:val="19"/>
-                <w:lang w:val="es-MX"/>
-              </w:rPr>
-              <w:t>¿Cómo escala a más carreras?</w:t>
-            </w:r>
-          </w:p>
-        </w:tc>
-        <w:tc>
-          <w:tcPr>
-            <w:tcW w:w="4320" w:type="dxa"/>
-          </w:tcPr>
-          <w:p>
-            <w:pPr>
-              <w:rPr>
-                <w:lang w:val="es-MX"/>
-              </w:rPr>
-            </w:pPr>
-            <w:r>
-              <w:rPr>
-                <w:sz w:val="19"/>
-                <w:lang w:val="es-MX"/>
-              </w:rPr>
-              <w:t xml:space="preserve">El alcance ya lo soporta: </w:t>
-            </w:r>
-            <w:proofErr w:type="spellStart"/>
-            <w:r>
-              <w:rPr>
-                <w:sz w:val="19"/>
-                <w:lang w:val="es-MX"/>
-              </w:rPr>
-              <w:t>carrera|global</w:t>
-            </w:r>
-            <w:proofErr w:type="spellEnd"/>
-            <w:r>
-              <w:rPr>
-                <w:sz w:val="19"/>
-                <w:lang w:val="es-MX"/>
-              </w:rPr>
-              <w:t xml:space="preserve"> y </w:t>
-            </w:r>
-            <w:proofErr w:type="spellStart"/>
-            <w:r>
-              <w:rPr>
-                <w:sz w:val="19"/>
-                <w:lang w:val="es-MX"/>
-              </w:rPr>
-              <w:t>carrera|curso:X</w:t>
-            </w:r>
-            <w:proofErr w:type="spellEnd"/>
-            <w:r>
-              <w:rPr>
-                <w:sz w:val="19"/>
-                <w:lang w:val="es-MX"/>
-              </w:rPr>
-              <w:t>.</w:t>
-            </w:r>
-          </w:p>
-        </w:tc>
-      </w:tr>
-      <w:tr>
-        <w:tc>
-          <w:tcPr>
-            <w:tcW w:w="4320" w:type="dxa"/>
-          </w:tcPr>
-          <w:p>
-            <w:r>
-              <w:rPr>
-                <w:sz w:val="19"/>
-              </w:rPr>
-              <w:t xml:space="preserve">¿Es </w:t>
-            </w:r>
-            <w:proofErr w:type="spellStart"/>
-            <w:r>
-              <w:rPr>
-                <w:sz w:val="19"/>
-              </w:rPr>
-              <w:t>seguro</w:t>
-            </w:r>
-            <w:proofErr w:type="spellEnd"/>
-            <w:r>
-              <w:rPr>
-                <w:sz w:val="19"/>
-              </w:rPr>
-              <w:t xml:space="preserve"> / privado?</w:t>
-            </w:r>
-          </w:p>
-        </w:tc>
-        <w:tc>
-          <w:tcPr>
-            <w:tcW w:w="4320" w:type="dxa"/>
-          </w:tcPr>
-          <w:p>
-            <w:pPr>
-              <w:rPr>
-                <w:lang w:val="es-MX"/>
-              </w:rPr>
-            </w:pPr>
-            <w:r>
-              <w:rPr>
-                <w:sz w:val="19"/>
-                <w:lang w:val="es-MX"/>
-              </w:rPr>
-              <w:t>Las métricas son anónimas; no se guarda quién pregunta.</w:t>
-            </w:r>
-          </w:p>
-        </w:tc>
-      </w:tr>
-      <w:tr>
-        <w:tc>
-          <w:tcPr>
-            <w:tcW w:w="4320" w:type="dxa"/>
-          </w:tcPr>
-          <w:p>
-            <w:r>
-              <w:rPr>
-                <w:sz w:val="19"/>
-              </w:rPr>
-              <w:t xml:space="preserve">¿La U </w:t>
-            </w:r>
-            <w:proofErr w:type="spellStart"/>
-            <w:r>
-              <w:rPr>
-                <w:sz w:val="19"/>
-              </w:rPr>
-              <w:t>podría</w:t>
-            </w:r>
-            <w:proofErr w:type="spellEnd"/>
-            <w:r>
-              <w:rPr>
-                <w:sz w:val="19"/>
-              </w:rPr>
-              <w:t xml:space="preserve"> </w:t>
-            </w:r>
-            <w:proofErr w:type="spellStart"/>
-            <w:r>
-              <w:rPr>
-                <w:sz w:val="19"/>
-              </w:rPr>
-              <w:t>usarlo</w:t>
-            </w:r>
-            <w:proofErr w:type="spellEnd"/>
-            <w:r>
-              <w:rPr>
-                <w:sz w:val="19"/>
-              </w:rPr>
-              <w:t>?</w:t>
-            </w:r>
-          </w:p>
-        </w:tc>
-        <w:tc>
-          <w:tcPr>
-            <w:tcW w:w="4320" w:type="dxa"/>
-          </w:tcPr>
-          <w:p>
-            <w:pPr>
-              <w:rPr>
-                <w:lang w:val="es-MX"/>
-              </w:rPr>
-            </w:pPr>
-            <w:r>
-              <w:rPr>
-                <w:sz w:val="19"/>
-                <w:lang w:val="es-MX"/>
-              </w:rPr>
-              <w:t>Sí: la lógica está expuesta como API REST (</w:t>
-            </w:r>
-            <w:proofErr w:type="spellStart"/>
-            <w:r>
-              <w:rPr>
-                <w:sz w:val="19"/>
-                <w:lang w:val="es-MX"/>
-              </w:rPr>
-              <w:t>FastAPI</w:t>
-            </w:r>
-            <w:proofErr w:type="spellEnd"/>
-            <w:r>
-              <w:rPr>
-                <w:sz w:val="19"/>
-                <w:lang w:val="es-MX"/>
-              </w:rPr>
-              <w:t xml:space="preserve">), la consume cualquier </w:t>
-            </w:r>
-            <w:proofErr w:type="spellStart"/>
-            <w:r>
-              <w:rPr>
-                <w:sz w:val="19"/>
-                <w:lang w:val="es-MX"/>
-              </w:rPr>
-              <w:t>front</w:t>
-            </w:r>
-            <w:proofErr w:type="spellEnd"/>
-            <w:r>
-              <w:rPr>
-                <w:sz w:val="19"/>
-                <w:lang w:val="es-MX"/>
-              </w:rPr>
-              <w:t>.</w:t>
-            </w:r>
-          </w:p>
-        </w:tc>
-      </w:tr>
-    </w:tbl>
-    <w:p>
-      <w:pPr>
-        <w:spacing w:after="40"/>
-        <w:rPr>
-          <w:lang w:val="es-MX"/>
-        </w:rPr>
-      </w:pPr>
     </w:p>
     <w:sectPr>
       <w:pgSz w:w="12240" w:h="15840"/>
@@ -4120,7 +1930,7 @@
   <w:style w:type="paragraph" w:default="1" w:styleId="Normal">
     <w:name w:val="Normal"/>
     <w:qFormat/>
-    <w:rsid w:val="00FC693F"/>
+    <w:rsid w:val="00EA2F0C"/>
     <w:rPr>
       <w:rFonts w:ascii="Calibri" w:hAnsi="Calibri"/>
     </w:rPr>

</xml_diff>